<commit_message>
Refuse unsupported languages clearly and show code without ligatures
- A .js, .ts, .go, ... file now gets "JavaScript (.js) is not
  supported. SyntaxLens checks Python, Java, C, C++ and C#" instead of
  being guessed as Java and flagged with false errors. Choosing a
  language explicitly still analyzes it.
- The web editor no longer draws '<<' as a single '≪' symbol (font
  ligatures in Cascadia Code, the default code font on Windows).
- Manual and defense guide: 610 tests; the spec examples match line for
  line, except the Target Syntax Rule line naming the detected language.
</commit_message>
<xml_diff>
--- a/docs/SyntaxLens_User_Manual.docx
+++ b/docs/SyntaxLens_User_Manual.docx
@@ -621,7 +621,7 @@
         <w:t>Mode 3, Upload File:</w:t>
       </w:r>
       <w:r>
-        <w:t xml:space="preserve"> drag a file onto the box, or click it to choose one (.py, .java, .c, .cpp, .h, .cs, .txt; up to 2 MB). Empty, binary (e.g. images) and oversized files are refused with a message.</w:t>
+        <w:t xml:space="preserve"> drag a file onto the box, or click it to choose one (.py, .java, .c, .cpp, .h, .cs, .txt; up to 2 MB). Empty, binary (e.g. images) and oversized files, and files in other languages (e.g. .js), are refused with a message.</w:t>
       </w:r>
     </w:p>
     <w:p>
@@ -3272,7 +3272,7 @@
         <w:rPr>
           <w:b/>
         </w:rPr>
-        <w:t>606 automated tests</w:t>
+        <w:t>610 automated tests</w:t>
       </w:r>
       <w:r>
         <w:t xml:space="preserve"> run on Windows and Linux with Python 3.10 to 3.14 on every change.</w:t>
@@ -3284,7 +3284,16 @@
         <w:spacing w:after="30"/>
       </w:pPr>
       <w:r>
-        <w:t>Both example reports of the specification are reproduced exactly, word for word.</w:t>
+        <w:t xml:space="preserve">Both example reports of the specification are reproduced line for line; only the </w:t>
+      </w:r>
+      <w:r>
+        <w:rPr>
+          <w:i/>
+        </w:rPr>
+        <w:t>Target Syntax Rule</w:t>
+      </w:r>
+      <w:r>
+        <w:t xml:space="preserve"> line differs, because it names the detected language.</w:t>
       </w:r>
     </w:p>
     <w:p>

</xml_diff>